<commit_message>
Versión 2 de los oficios a la Contraloría (983 y 1058) tras revisión cruzada, y nota interna ampliada
Co-Authored-By: Claude Fable 5.1 <noreply@anthropic.com>
Claude-Session: https://claude.ai/code/session_01NggVVH6ZcSieraGNYfYzQF
</commit_message>
<xml_diff>
--- a/caso-contraloria-ese-hrc/Nota interna de revision - Oficios Contraloria 983 y 1058.docx
+++ b/caso-contraloria-ese-hrc/Nota interna de revision - Oficios Contraloria 983 y 1058.docx
@@ -68,7 +68,7 @@
         <w:pStyle w:val="BodyText"/>
       </w:pPr>
       <w:r>
-        <w:t xml:space="preserve">Los fragmentos resaltados en amarillo dentro de los oficios son marcadores de posición. Señalan documentos que no están en la carpeta compartida o decisiones que corresponden a la entidad. Deben resolverse y retirar el resaltado antes de radicar.</w:t>
+        <w:t xml:space="preserve">Los oficios fueron sometidos a una revisión cruzada con cuatro lentes (auditor, jurídica, de hechos y de estilo) y a una consolidación que confirmó o refutó cada hallazgo; esta versión incorpora las correcciones confirmadas. Los fragmentos resaltados en amarillo dentro de los oficios son marcadores de posición. Señalan documentos que no están en la carpeta compartida o decisiones que corresponden a la entidad. Deben resolverse y retirar el resaltado antes de radicar.</w:t>
       </w:r>
     </w:p>
     <w:bookmarkEnd w:id="20"/>
@@ -152,7 +152,7 @@
         </w:numPr>
       </w:pPr>
       <w:r>
-        <w:t xml:space="preserve">Número de la póliza. El acta de aprobación de pólizas registra</w:t>
+        <w:t xml:space="preserve">Número y vigencia de la póliza. El acta de aprobación de pólizas registra</w:t>
       </w:r>
       <w:r>
         <w:t xml:space="preserve"> </w:t>
@@ -218,6 +218,21 @@
         <w:t xml:space="preserve">”</w:t>
       </w:r>
       <w:r>
+        <w:t xml:space="preserve">. La vigencia de los amparos termina el 7 de mayo de 2026: si el plazo de un mes se cuenta desde el acta de inicio del 9 de octubre de 2025, el plazo más seis meses llegaría al 8 de mayo de 2026, un día después. Por eso el oficio dice que la vigencia supera en más de seis meses el recibo final de los bienes y advierte los errores de transcripción del acta, en lugar de afirmar que cubre</w:t>
+      </w:r>
+      <w:r>
+        <w:t xml:space="preserve"> </w:t>
+      </w:r>
+      <w:r>
+        <w:t xml:space="preserve">“</w:t>
+      </w:r>
+      <w:r>
+        <w:t xml:space="preserve">el plazo y seis meses más</w:t>
+      </w:r>
+      <w:r>
+        <w:t xml:space="preserve">”</w:t>
+      </w:r>
+      <w:r>
         <w:t xml:space="preserve">.</w:t>
       </w:r>
     </w:p>
@@ -291,7 +306,7 @@
         <w:t xml:space="preserve"> </w:t>
       </w:r>
       <w:r>
-        <w:t xml:space="preserve">para la mínima cuantía, y el cuadro de trabajo cita el artículo 28; para el contrato 1058 la entidad cita las causales 30.2.16 y 30.2.21 y el cuadro de trabajo indica que la Resolución 002 de 2023 las numera como 29.2.x. Los oficios no citan números de artículo del Manual precisamente por esta duda. Conviene confrontar la Resolución 002 de 2023 y unificar la numeración en todos los documentos que se radiquen. Además, el contrato 1055 de 2025 de la misma entidad cita como Manual vigente la Resolución 143 del 22 de septiembre de 2025, que modifica el Manual; si esa modificación regía en octubre y diciembre de 2025, los oficios y los documentos aclaratorios deben citarla. Por esta razón los oficios dicen</w:t>
+        <w:t xml:space="preserve">para la mínima cuantía, y el cuadro de trabajo cita el artículo 28; para el contrato 1058 la entidad cita las causales 30.2.16 y 30.2.21 y el cuadro de trabajo indica que la Resolución 002 de 2023 las numera como 29.2.x. Los oficios no citan números de artículo del Manual precisamente por esta duda. Conviene confrontar la Resolución 002 de 2023 y unificar la numeración en todos los documentos que se radiquen. Además, el contrato 1055 de 2025 de la misma entidad cita como Manual vigente la Resolución 143 del 22 de septiembre de 2025, que modifica el Manual; si esa modificación regía en octubre y diciembre de 2025, los oficios y los documentos aclaratorios deben citarla. El Acuerdo 017 de 2022 también habría sido modificado por el Acuerdo 021 del 16 de septiembre de 2025. Por esta razón los oficios dicen</w:t>
       </w:r>
       <w:r>
         <w:t xml:space="preserve"> </w:t>
@@ -306,7 +321,10 @@
         <w:t xml:space="preserve">”</w:t>
       </w:r>
       <w:r>
-        <w:t xml:space="preserve">.</w:t>
+        <w:t xml:space="preserve"> </w:t>
+      </w:r>
+      <w:r>
+        <w:t xml:space="preserve">y dejan marcadores en los artículos del Manual.</w:t>
       </w:r>
     </w:p>
     <w:p>
@@ -361,7 +379,7 @@
         </w:numPr>
       </w:pPr>
       <w:r>
-        <w:t xml:space="preserve">Fecha del egreso frente a la certificación de supervisión. El cuadro de trabajo anota que el informe de actividades y la certificación del 27 de noviembre de 2025 son posteriores al egreso. El oficio sostiene que el pago se soportó en el acta de recibo final del 31 de octubre y en el ingreso a almacén del 20 de octubre; hay que confirmar la fecha del comprobante de egreso y que el acta de recibo final existe, está firmada y es anterior al pago. Si el pago se hizo sin acta de recibo, el literal i) del oficio debe reescribirse.</w:t>
+        <w:t xml:space="preserve">Fecha del egreso frente a la certificación de supervisión. El cuadro de trabajo anota que el informe de actividades y la certificación del 27 de noviembre de 2025 son posteriores al egreso. El oficio sostiene que el pago se soportó en el acta de recibo final del 31 de octubre y en el ingreso a almacén del 20 de octubre; hay que confirmar la fecha del comprobante de egreso y que el acta de recibo final existe, está firmada y es anterior al pago. El literal i) del oficio deja marcadores para el número y la fecha del comprobante de egreso y reconoce que el informe de actividades y el formato de supervisión se incorporaron después del pago, con la acción de mejora correspondiente. Si el pago se hizo sin acta de recibo, debe usarse el texto alternativo del marcador.</w:t>
       </w:r>
     </w:p>
     <w:p>
@@ -427,7 +445,7 @@
         <w:t xml:space="preserve">”</w:t>
       </w:r>
       <w:r>
-        <w:t xml:space="preserve">. Si el documento se elaboró ahora para reconstruir la cronología, debe llevar la fecha actual y presentarse como certificación de hechos pasados suscrita por la proponente y por el líder de contratación; presentar ante la Contraloría un documento con fecha anterior a la de su elaboración expone a la entidad y a los firmantes a un riesgo penal y disciplinario mucho mayor que la observación que se pretende subsanar. El oficio se redactó de manera que no afirma la fecha de firma de la constancia. En el mismo sentido, la respuesta técnica y jurídica habla a la vez de</w:t>
+        <w:t xml:space="preserve">. Si el documento se elaboró ahora para reconstruir la cronología, debe llevar la fecha actual y presentarse como certificación de hechos pasados suscrita por la proponente y por el líder de contratación; presentar ante la Contraloría un documento con fecha anterior a la de su elaboración expone a la entidad y a los firmantes a un riesgo penal y disciplinario mucho mayor que la observación que se pretende subsanar. El oficio deja un marcador para consignar la fecha real de suscripción y, si el documento es de 2026, presentarlo como certificación de hechos pasados. En el mismo sentido, la respuesta técnica y jurídica habla a la vez de</w:t>
       </w:r>
       <w:r>
         <w:t xml:space="preserve"> </w:t>
@@ -486,7 +504,7 @@
         <w:t xml:space="preserve">”</w:t>
       </w:r>
       <w:r>
-        <w:t xml:space="preserve">. El contrato se suscribió en los primeros días de octubre de 2025, la factura es del 17 de octubre y el ingreso a almacén del 20 de octubre, de modo que el hecho generador pudo ocurrir antes de la entrada en vigencia de esa ordenanza; en ese caso la norma aplicable sería el estatuto anterior, que según oficios de la Secretaría de Hacienda departamental de 2025 era la Ordenanza 010 del 21 de septiembre de 2018, modificada por la Ordenanza 002 del 14 de junio de 2023. Antes de aceptar la omisión conviene confirmar qué estatuto regía en la fecha del hecho generador y si bajo ese estatuto también aplicaban las tres estampillas. Además hay que definir quién asume los valores no descontados, pues la retención ya no puede practicarse sobre un pago agotado: reintegro por la contratista o reconocimiento por la entidad. Por último, la misma exclusión que la entidad invoca para el contrato 1058 (contratos de hospitales públicos destinados a servicios de salud del plan de beneficios) podría discutirse para el 983, cuyo objeto es la dotación de los Equipos Básicos en Salud con recursos de la Resolución 877 de 2025. La posición adoptada (más estampillas para el 983 y ninguna para el 1058) es defendible por la diferencia de objetos, pero debe ser una decisión consciente, porque el equipo auditor verá las dos respuestas juntas.</w:t>
+        <w:t xml:space="preserve">. El contrato se suscribió en los primeros días de octubre de 2025, la factura es del 17 de octubre y el ingreso a almacén del 20 de octubre, de modo que el hecho generador pudo ocurrir antes de la entrada en vigencia de esa ordenanza; en ese caso la norma aplicable sería el estatuto anterior, que según oficios de la Secretaría de Hacienda departamental de 2025 era la Ordenanza 010 del 21 de septiembre de 2018, modificada por la Ordenanza 002 del 14 de junio de 2023. Antes de aceptar la omisión conviene confirmar qué estatuto regía en la fecha del hecho generador y si bajo ese estatuto también aplicaban las tres estampillas. Además hay que definir quién asume los valores no descontados, pues la retención ya no puede practicarse sobre un pago agotado: reintegro por la contratista o reconocimiento por la entidad. Tampoco se retuvo en el 983 la Tasa Prodeporte y Recreación, que al 2,5% sobre $43.990.000 representaría cerca de $1.099.750; la revisión debe incluirla. Por eso el literal k) del oficio ya no acepta estampillas concretas: anuncia la verificación frente al estatuto vigente en la fecha del hecho generador, con marcadores para la fecha del pago, la consulta a la Secretaría de Hacienda y quién asume los valores, como complemento de la comunicación del 5 de octubre de 2026. La exclusión que la entidad invoca para el 1058 (artículo 340, numeral 4, de la Ordenanza 018 de 2025) no se extiende al 983: si el hecho generador del 983 es anterior a esa ordenanza, la exclusión no rige, y el objeto (dotación informática) no es un servicio de salud del plan de beneficios. El equipo auditor verá las dos respuestas juntas, de modo que la posición debe ser coherente: verificación y liquidación en el 983, exclusión sometida a consideración en el 1058.</w:t>
       </w:r>
     </w:p>
     <w:bookmarkEnd w:id="22"/>
@@ -537,7 +555,106 @@
         <w:t xml:space="preserve">”</w:t>
       </w:r>
       <w:r>
-        <w:t xml:space="preserve">, lo que contradice el régimen de derecho privado de la E.S.E. (Ley 100 de 1993, artículo 195, numeral 6); la redacción correcta es que el contrato se rige por el derecho privado y por el Manual, con aplicación de los principios de la función administrativa y de la gestión fiscal y del régimen de inhabilidades e incompatibilidades (Ley 1150 de 2007, artículo 13), y que las garantías se constituyeron con los amparos propios de las entidades estatales. El acta tampoco indica la fecha de suscripción. Las mismas precisiones valen para el acta aclaratoria al acta de liquidación.</w:t>
+        <w:t xml:space="preserve">, lo que contradice el régimen de derecho privado de la E.S.E. (Ley 100 de 1993, artículo 195, numeral 6); la redacción correcta es que el contrato se rige por el derecho privado y por el Manual, con aplicación de los principios de la función administrativa y de la gestión fiscal y del régimen de inhabilidades e incompatibilidades (Ley 1150 de 2007, artículo 13), y que las garantías se constituyeron con los amparos propios de las entidades estatales. El acta tampoco indica la fecha de suscripción. Las mismas precisiones valen para el acta aclaratoria al acta de liquidación, que conviene extender al acta de recibo final (encabezado</w:t>
+      </w:r>
+      <w:r>
+        <w:t xml:space="preserve"> </w:t>
+      </w:r>
+      <w:r>
+        <w:t xml:space="preserve">“</w:t>
+      </w:r>
+      <w:r>
+        <w:t xml:space="preserve">invitación directa por régimen especial</w:t>
+      </w:r>
+      <w:r>
+        <w:t xml:space="preserve">”</w:t>
+      </w:r>
+      <w:r>
+        <w:t xml:space="preserve">,</w:t>
+      </w:r>
+      <w:r>
+        <w:t xml:space="preserve"> </w:t>
+      </w:r>
+      <w:r>
+        <w:t xml:space="preserve">“</w:t>
+      </w:r>
+      <w:r>
+        <w:t xml:space="preserve">dieciséis (16) días</w:t>
+      </w:r>
+      <w:r>
+        <w:t xml:space="preserve">”</w:t>
+      </w:r>
+      <w:r>
+        <w:t xml:space="preserve">,</w:t>
+      </w:r>
+      <w:r>
+        <w:t xml:space="preserve"> </w:t>
+      </w:r>
+      <w:r>
+        <w:t xml:space="preserve">“</w:t>
+      </w:r>
+      <w:r>
+        <w:t xml:space="preserve">régimen: común</w:t>
+      </w:r>
+      <w:r>
+        <w:t xml:space="preserve">”</w:t>
+      </w:r>
+      <w:r>
+        <w:t xml:space="preserve"> </w:t>
+      </w:r>
+      <w:r>
+        <w:t xml:space="preserve">y</w:t>
+      </w:r>
+      <w:r>
+        <w:t xml:space="preserve"> </w:t>
+      </w:r>
+      <w:r>
+        <w:t xml:space="preserve">“</w:t>
+      </w:r>
+      <w:r>
+        <w:t xml:space="preserve">Contrato No. 103 de 2025</w:t>
+      </w:r>
+      <w:r>
+        <w:t xml:space="preserve">”</w:t>
+      </w:r>
+      <w:r>
+        <w:t xml:space="preserve">). Además, la comunicación del 5 de octubre de 2026 sobre la Inconsistencia N° 8 conserva los residuos</w:t>
+      </w:r>
+      <w:r>
+        <w:t xml:space="preserve"> </w:t>
+      </w:r>
+      <w:r>
+        <w:t xml:space="preserve">“</w:t>
+      </w:r>
+      <w:r>
+        <w:t xml:space="preserve">[cite: 11, 12]</w:t>
+      </w:r>
+      <w:r>
+        <w:t xml:space="preserve">”</w:t>
+      </w:r>
+      <w:r>
+        <w:t xml:space="preserve"> </w:t>
+      </w:r>
+      <w:r>
+        <w:t xml:space="preserve">y</w:t>
+      </w:r>
+      <w:r>
+        <w:t xml:space="preserve"> </w:t>
+      </w:r>
+      <w:r>
+        <w:t xml:space="preserve">“</w:t>
+      </w:r>
+      <w:r>
+        <w:t xml:space="preserve">[cite: 28]</w:t>
+      </w:r>
+      <w:r>
+        <w:t xml:space="preserve">”</w:t>
+      </w:r>
+      <w:r>
+        <w:t xml:space="preserve"> </w:t>
+      </w:r>
+      <w:r>
+        <w:t xml:space="preserve">en un documento firmado por la Gerente, y el numeral 4 de la certificación sobre esa inconsistencia afirma que las fechas del formato corresponden a los plazos reales, cuando el oficio reconoce que el plazo de veinte días y la fecha de terminación son errores; hay que retirar los residuos y corregir el numeral antes de anexar. La causal de contratación directa por cooperativa asociada exige acreditar que la E.S.E. es asociada de COHOSAN: ningún anexo trae el certificado de asociación, el certificado de existencia y representación ni el RUT, del que también depende la no retención de renta; el oficio los relaciona como anexo por obtener y, si no se consiguen, debe sostenerse la modalidad sólo en la causal de suministro de medicamentos, elementos hospitalarios y de laboratorio.</w:t>
       </w:r>
     </w:p>
     <w:p>
@@ -596,7 +713,7 @@
         </w:numPr>
       </w:pPr>
       <w:r>
-        <w:t xml:space="preserve">Medicamentos facturados con cargo al contrato. El argumento de conexidad asistencial es razonable, pero el objeto del contrato no incluía medicamentos y el propio anexo aclaratorio los excluyó. El oficio reconoce la deficiencia de planeación, acredita que los bienes ingresaron y se consumieron y propone la acción de mejora. Es la línea más sólida frente al control fiscal: sin daño patrimonial no hay responsabilidad fiscal, aunque pueda quedar un hallazgo administrativo. Conviene tener a mano el soporte del precio del Alacramyn ($739.731 por vial) por si el equipo auditor compara precios.</w:t>
+        <w:t xml:space="preserve">Medicamentos facturados con cargo al contrato. El argumento de conexidad asistencial es razonable, pero el objeto del contrato no incluía medicamentos y el propio anexo aclaratorio los excluyó. El oficio reconoce la deficiencia de planeación, acredita que los bienes ingresaron y se consumieron y propone la acción de mejora. Es la línea más sólida frente al control fiscal: sin daño patrimonial no hay responsabilidad fiscal, aunque pueda quedar un hallazgo administrativo. El oficio añade el argumento más sólido: la causal del Manual que amparó la contratación directa comprende también el suministro de medicamentos, de modo que proveedor y modalidad habrían sido los mismos, y la deficiencia queda reducida a la descripción del objeto. Conviene tener a mano el soporte del precio del Alacramyn ($739.731 por vial), su lote, vencimiento y registro sanitario, por si el equipo auditor los pide.</w:t>
       </w:r>
     </w:p>
     <w:p>
@@ -607,22 +724,25 @@
         </w:numPr>
       </w:pPr>
       <w:r>
-        <w:t xml:space="preserve">Imputación por rubros. Según el cuadro de trabajo, los ítems de laboratorio suman cerca de $29,4 millones, pero al rubro de laboratorio se imputaron $24.998.477. La certificación financiera lo explica como dinámica operativa dentro de la misma apropiación. Es una explicación aceptable para descartar extralimitación, pero no elimina la observación sobre especialización del gasto. Conviene evitar la expresión</w:t>
-      </w:r>
-      <w:r>
-        <w:t xml:space="preserve"> </w:t>
-      </w:r>
-      <w:r>
-        <w:t xml:space="preserve">“</w:t>
-      </w:r>
-      <w:r>
-        <w:t xml:space="preserve">variación en la afectación entre subrubros</w:t>
-      </w:r>
-      <w:r>
-        <w:t xml:space="preserve">”</w:t>
-      </w:r>
-      <w:r>
-        <w:t xml:space="preserve">, que puede leerse como un traslado presupuestal sin acto de la Junta Directiva, a la que los Estatutos de la E.S.E. (Acuerdo 006 de 2014, artículo 79) reservan las modificaciones del presupuesto. El oficio sostiene, con las cifras del registro presupuestal 1585 ($15.000.000 en material médico quirúrgico y $25.000.000 en laboratorio) y del acta de recibo final, que ninguno de los dos rubros se excedió y que la observación recae sólo en la clasificación de algunos ítems.</w:t>
+        <w:t xml:space="preserve">Imputación por rubros. Según el cuadro de trabajo, los ítems de laboratorio suman cerca de $29,4 millones, pero al rubro de laboratorio se imputaron $24.998.477. La certificación financiera lo explica como dinámica operativa dentro de la misma apropiación. Es una explicación aceptable para descartar extralimitación, pero no elimina la observación sobre especialización del gasto. La expresión</w:t>
+      </w:r>
+      <w:r>
+        <w:t xml:space="preserve"> </w:t>
+      </w:r>
+      <w:r>
+        <w:t xml:space="preserve">“</w:t>
+      </w:r>
+      <w:r>
+        <w:t xml:space="preserve">variación en la afectación contable entre los subrubros</w:t>
+      </w:r>
+      <w:r>
+        <w:t xml:space="preserve">”</w:t>
+      </w:r>
+      <w:r>
+        <w:t xml:space="preserve"> </w:t>
+      </w:r>
+      <w:r>
+        <w:t xml:space="preserve">está en la certificación financiera firmada el 2 de octubre de 2026 que se va a anexar, y puede leerse como un traslado presupuestal sin acto de la Junta Directiva, a la que los Estatutos de la E.S.E. (Acuerdo 006 de 2014, artículo 79) reservan las modificaciones del presupuesto; conviene reexpedir la certificación con fecha de 2026, certificando la distribución del registro presupuestal por rubro, la ejecución por rubro sin traslados y que el RP 1323, el CDP 1574 y el rubro 2.4.5.01.02.01 son ajenos al contrato. El oficio sostiene, con las cifras del registro presupuestal 1585 ($15.000.000 en material médico quirúrgico y $25.000.000 en laboratorio) y del acta de recibo final, que ninguno de los dos rubros se excedió y que la observación recae sólo en la clasificación de algunos ítems.</w:t>
       </w:r>
     </w:p>
     <w:p>
@@ -735,7 +855,7 @@
         <w:t xml:space="preserve"> </w:t>
       </w:r>
       <w:r>
-        <w:t xml:space="preserve">del aplicativo de rendición puede ser la correcta, pues describe un contrato celebrado sin convocatoria competitiva. Por eso el oficio del 1058 no la presenta como error, a diferencia del 983, donde sí hubo invitación y oferta; lo que sí reconoce como error en el 1058 son el rubro y la fecha de terminación. Si la Contraloría entiende la casilla de otra manera, la petición de indicar el procedimiento de corrección cubre ambos casos.</w:t>
+        <w:t xml:space="preserve">del aplicativo de rendición puede ser la correcta, pues describe un contrato celebrado sin convocatoria competitiva. Por eso el oficio del 1058 la presenta como la opción que la entidad entiende aplicable, sin afirmarlo como hecho, pues las opciones del formato y la resolución de rendición de la Contraloría no pudieron verificarse; a diferencia del 983, donde sí hubo invitación y oferta. Lo que sí reconoce como error en el 1058 son el rubro, el plazo de veinte días y la fecha de terminación. Si la Contraloría entiende la casilla de otra manera, la petición de indicar el procedimiento de corrección cubre ambos casos.</w:t>
       </w:r>
     </w:p>
     <w:p>
@@ -767,7 +887,7 @@
         </w:numPr>
       </w:pPr>
       <w:r>
-        <w:t xml:space="preserve">Fecha y plazo. Los oficios están fechados el 7 de octubre de 2026 porque las setenta y dos horas hábiles pedidas el viernes 2 de octubre vencen ese día. Si la Contraloría concedió el plazo por escrito, conviene citar esa comunicación.</w:t>
+        <w:t xml:space="preserve">Fecha y plazo. Los oficios están fechados el 7 de octubre de 2026. Las setenta y dos horas hábiles pedidas el viernes 2 de octubre vencen el martes 6 o el miércoles 7 según cómo se cuente el día del recibo, de modo que conviene radicar de inmediato por la Ventanilla Única, citando la solicitud de plazo y, si existe, la comunicación de la Contraloría que lo concedió. El requerimiento del 1 de octubre incluyó también el contrato 1056; si su respuesta no está lista, debe radicarse al menos una comunicación que informe la fecha de entrega, porque la no atención de un requerimiento es sancionable conforme a los artículos 100 y 101 de la Ley 42 de 1993, citados en la carta de presentación de la auditoría.</w:t>
       </w:r>
     </w:p>
     <w:p>

</xml_diff>